<commit_message>
Add the test-design confound to the debugging script; fix its timings
The strongest debugging story in the project was missing from LOOM2 because I
wrote it before the re-run: applying the same "what if the framing is wrong"
question to my own conclusions, finding the confound, and controlling for it.
Same move as testing Twilio's error message, one level up.

Beat timings were aspirational - 635 narrated words is ~4 min, not 3. Re-timed
to a measured pace, and noted the 3-minute cap applies to the walkthrough only.

Co-Authored-By: Claude Opus 5 (1M context) <noreply@anthropic.com>
</commit_message>
<xml_diff>
--- a/LOOM2-DEBUGGING.docx
+++ b/LOOM2-DEBUGGING.docx
@@ -7,33 +7,32 @@
         <w:pStyle w:val="Heading1"/>
       </w:pPr>
       <w:r>
-        <w:t>Loom 2 — AI debugging walkthrough (3 min)</w:t>
+        <w:t>Loom 2 — AI debugging walkthrough (~4 min)</w:t>
       </w:r>
     </w:p>
     <w:p>
       <w:r>
-        <w:t>They want to see the loop: symptom → hypothesis → evidence → fix → *and then fix</w:t>
+        <w:t>No time limit on this one — the 3-minute cap is on the walkthrough. Timings are</w:t>
       </w:r>
     </w:p>
     <w:p>
       <w:r>
-        <w:t>whatever should have caught it*. One bug, shown properly, beats three summarised.</w:t>
+        <w:t>measured at a normal speaking pace.</w:t>
       </w:r>
     </w:p>
     <w:p>
       <w:r>
-        <w:rPr>
-          <w:b/>
-        </w:rPr>
-        <w:t>Use this bug:</w:t>
-      </w:r>
-      <w:r>
-        <w:t xml:space="preserve"> the first live call connected and died in one second. It's the best</w:t>
+        <w:t>Show the loop: symptom → hypothesis → evidence → fix → *then fix whatever should</w:t>
       </w:r>
     </w:p>
     <w:p>
       <w:r>
-        <w:t>one because the error message actively lied about the cause.</w:t>
+        <w:t>have caught it*. One bug shown properly beats three summarised. Use the first live</w:t>
+      </w:r>
+    </w:p>
+    <w:p>
+      <w:r>
+        <w:t>call: it died in one second and the error message blamed the wrong component.</w:t>
       </w:r>
     </w:p>
     <w:p>
@@ -175,7 +174,7 @@
         <w:rPr>
           <w:b/>
         </w:rPr>
-        <w:t>0:20 · Ask the tool for the error, not for a guess</w:t>
+        <w:t>0:25 · Ask the tool for the error, not for a guess</w:t>
       </w:r>
       <w:r>
         <w:t xml:space="preserve"> — *show the prompt*</w:t>
@@ -212,7 +211,7 @@
         <w:rPr>
           <w:b/>
         </w:rPr>
-        <w:t>0:50 · Test the accusation before accepting it</w:t>
+        <w:t>1:00 · Test the accusation before accepting it</w:t>
       </w:r>
     </w:p>
     <w:p>
@@ -233,12 +232,7 @@
         <w:pStyle w:val="ListBullet"/>
       </w:pPr>
       <w:r>
-        <w:t>Worth saying out loud: the error message was true but misleading. My server *did*</w:t>
-      </w:r>
-    </w:p>
-    <w:p>
-      <w:r>
-        <w:t>close the connection — it just closed it on purpose.</w:t>
+        <w:t>The error was true but misleading: my server *did* close the connection — on purpose.</w:t>
       </w:r>
     </w:p>
     <w:p>
@@ -246,7 +240,7 @@
         <w:rPr>
           <w:b/>
         </w:rPr>
-        <w:t>1:20 · Stop guessing, add evidence</w:t>
+        <w:t>1:40 · Stop guessing, add evidence</w:t>
       </w:r>
     </w:p>
     <w:p>
@@ -334,7 +328,7 @@
         <w:rPr>
           <w:b/>
         </w:rPr>
-        <w:t>2:10 · Then fix the thing that should have caught it</w:t>
+        <w:t>2:30 · Then fix the thing that should have caught it</w:t>
       </w:r>
       <w:r>
         <w:t xml:space="preserve"> — *the part I'd want to see*</w:t>
@@ -371,7 +365,21 @@
         <w:rPr>
           <w:b/>
         </w:rPr>
-        <w:t>2:40 · The habit, in one line</w:t>
+        <w:t>3:10 · Same move, on my own conclusions</w:t>
+      </w:r>
+      <w:r>
+        <w:t xml:space="preserve"> — *show the table at the top of </w:t>
+      </w:r>
+      <w:r>
+        <w:rPr>
+          <w:rFonts w:ascii="Menlo" w:hAnsi="Menlo"/>
+          <w:color w:val="333333"/>
+          <w:sz w:val="19"/>
+        </w:rPr>
+        <w:t>BUGS.md</w:t>
+      </w:r>
+      <w:r>
+        <w:t>*</w:t>
       </w:r>
     </w:p>
     <w:p>
@@ -379,12 +387,57 @@
         <w:pStyle w:val="ListBullet"/>
       </w:pPr>
       <w:r>
-        <w:t>Every wrong turn came from trusting an error message's framing. Every fix came</w:t>
+        <w:t>I'd finished the bug report. Eight findings, two critical. Then I asked the same question I'd asked about the Twilio error: what if the framing is wrong?</w:t>
       </w:r>
     </w:p>
     <w:p>
       <w:r>
-        <w:t>from making the system say what it was actually doing.</w:t>
+        <w:t>&gt; "Re-read the transcripts and tell me whether my critical findings could be artifacts of my own test design."</w:t>
+      </w:r>
+    </w:p>
+    <w:p>
+      <w:pPr>
+        <w:pStyle w:val="ListBullet"/>
+      </w:pPr>
+      <w:r>
+        <w:t>They were. Twelve identities down one phone number, against a system that keys records to caller ID — I'd guaranteed the failures I was reporting.</w:t>
+      </w:r>
+    </w:p>
+    <w:p>
+      <w:pPr>
+        <w:pStyle w:val="ListBullet"/>
+      </w:pPr>
+      <w:r>
+        <w:t>So I re-ran six calls with the identity held constant. That isolated the real bug: it's the phone-verification code path that dead-ends, not the lookup. Twelve of eighteen calls hit it, none completed.</w:t>
+      </w:r>
+    </w:p>
+    <w:p>
+      <w:pPr>
+        <w:pStyle w:val="ListBullet"/>
+      </w:pPr>
+      <w:r>
+        <w:t>Worth saying plainly: the confound was hiding a sharper bug than the one it caused.</w:t>
+      </w:r>
+    </w:p>
+    <w:p>
+      <w:r>
+        <w:rPr>
+          <w:b/>
+        </w:rPr>
+        <w:t>3:45 · The habit, in one line</w:t>
+      </w:r>
+    </w:p>
+    <w:p>
+      <w:pPr>
+        <w:pStyle w:val="ListBullet"/>
+      </w:pPr>
+      <w:r>
+        <w:t>Every wrong turn came from trusting a framing — Twilio's, then my own. Every fix</w:t>
+      </w:r>
+    </w:p>
+    <w:p>
+      <w:r>
+        <w:t>came from making the system say what it was actually doing, and re-running.</w:t>
       </w:r>
     </w:p>
     <w:p>
@@ -392,7 +445,7 @@
         <w:pStyle w:val="Heading2"/>
       </w:pPr>
       <w:r>
-        <w:t>If asked what else the loop caught</w:t>
+        <w:t>Reference — other bugs the loop caught (not narrated)</w:t>
       </w:r>
     </w:p>
     <w:p>

</xml_diff>